<commit_message>
Implement Habeas V3 conditional language and interface
</commit_message>
<xml_diff>
--- a/templates/petition.docx
+++ b/templates/petition.docx
@@ -1,6 +1,6 @@
 
 <file path=word/document.xml><?xml version="1.0" encoding="utf-8"?>
-<w:document xmlns:wpc="http://schemas.microsoft.com/office/word/2010/wordprocessingCanvas" xmlns:cx="http://schemas.microsoft.com/office/drawing/2014/chartex" xmlns:cx1="http://schemas.microsoft.com/office/drawing/2015/9/8/chartex" xmlns:cx2="http://schemas.microsoft.com/office/drawing/2015/10/21/chartex" xmlns:cx3="http://schemas.microsoft.com/office/drawing/2016/5/9/chartex" xmlns:cx4="http://schemas.microsoft.com/office/drawing/2016/5/10/chartex" xmlns:cx5="http://schemas.microsoft.com/office/drawing/2016/5/11/chartex" xmlns:cx6="http://schemas.microsoft.com/office/drawing/2016/5/12/chartex" xmlns:cx7="http://schemas.microsoft.com/office/drawing/2016/5/13/chartex" xmlns:cx8="http://schemas.microsoft.com/office/drawing/2016/5/14/chartex" xmlns:mc="http://schemas.openxmlformats.org/markup-compatibility/2006" xmlns:aink="http://schemas.microsoft.com/office/drawing/2016/ink" xmlns:am3d="http://schemas.microsoft.com/office/drawing/2017/model3d" xmlns:o="urn:schemas-microsoft-com:office:office" xmlns:oel="http://schemas.microsoft.com/office/2019/extlst" xmlns:r="http://schemas.openxmlformats.org/officeDocument/2006/relationships" xmlns:m="http://schemas.openxmlformats.org/officeDocument/2006/math" xmlns:v="urn:schemas-microsoft-com:vml" xmlns:wp14="http://schemas.microsoft.com/office/word/2010/wordprocessingDrawing" xmlns:wp="http://schemas.openxmlformats.org/drawingml/2006/wordprocessingDrawing" xmlns:w10="urn:schemas-microsoft-com:office:word" xmlns:w="http://schemas.openxmlformats.org/wordprocessingml/2006/main" xmlns:w14="http://schemas.microsoft.com/office/word/2010/wordml" xmlns:w15="http://schemas.microsoft.com/office/word/2012/wordml" xmlns:w16cei="http://schemas.microsoft.com/office/word/2026/wordml/cei" xmlns:w16cex="http://schemas.microsoft.com/office/word/2018/wordml/cex" xmlns:w16cid="http://schemas.microsoft.com/office/word/2016/wordml/cid" xmlns:w16="http://schemas.microsoft.com/office/word/2018/wordml" xmlns:w16du="http://schemas.microsoft.com/office/word/2023/wordml/word16du" xmlns:w16sdtdh="http://schemas.microsoft.com/office/word/2020/wordml/sdtdatahash" xmlns:w16sdtfl="http://schemas.microsoft.com/office/word/2024/wordml/sdtformatlock" xmlns:w16se="http://schemas.microsoft.com/office/word/2015/wordml/symex" xmlns:wpg="http://schemas.microsoft.com/office/word/2010/wordprocessingGroup" xmlns:wpi="http://schemas.microsoft.com/office/word/2010/wordprocessingInk" xmlns:wne="http://schemas.microsoft.com/office/word/2006/wordml" xmlns:wps="http://schemas.microsoft.com/office/word/2010/wordprocessingShape" mc:Ignorable="w14 w15 w16se w16cid w16 w16cex w16sdtdh w16sdtfl w16du wp14">
+<w:document xmlns:wpc="http://schemas.microsoft.com/office/word/2010/wordprocessingCanvas" xmlns:cx="http://schemas.microsoft.com/office/drawing/2014/chartex" xmlns:cx1="http://schemas.microsoft.com/office/drawing/2015/9/8/chartex" xmlns:cx2="http://schemas.microsoft.com/office/drawing/2015/10/21/chartex" xmlns:cx3="http://schemas.microsoft.com/office/drawing/2016/5/9/chartex" xmlns:cx4="http://schemas.microsoft.com/office/drawing/2016/5/10/chartex" xmlns:cx5="http://schemas.microsoft.com/office/drawing/2016/5/11/chartex" xmlns:cx6="http://schemas.microsoft.com/office/drawing/2016/5/12/chartex" xmlns:cx7="http://schemas.microsoft.com/office/drawing/2016/5/13/chartex" xmlns:cx8="http://schemas.microsoft.com/office/drawing/2016/5/14/chartex" xmlns:mc="http://schemas.openxmlformats.org/markup-compatibility/2006" xmlns:aink="http://schemas.microsoft.com/office/drawing/2016/ink" xmlns:am3d="http://schemas.microsoft.com/office/drawing/2017/model3d" xmlns:o="urn:schemas-microsoft-com:office:office" xmlns:oel="http://schemas.microsoft.com/office/2019/extlst" xmlns:r="http://schemas.openxmlformats.org/officeDocument/2006/relationships" xmlns:m="http://schemas.openxmlformats.org/officeDocument/2006/math" xmlns:v="urn:schemas-microsoft-com:vml" xmlns:wp14="http://schemas.microsoft.com/office/word/2010/wordprocessingDrawing" xmlns:wp="http://schemas.openxmlformats.org/drawingml/2006/wordprocessingDrawing" xmlns:w10="urn:schemas-microsoft-com:office:word" xmlns:w="http://schemas.openxmlformats.org/wordprocessingml/2006/main" xmlns:w14="http://schemas.microsoft.com/office/word/2010/wordml" xmlns:w15="http://schemas.microsoft.com/office/word/2012/wordml" xmlns:w16cex="http://schemas.microsoft.com/office/word/2018/wordml/cex" xmlns:w16cid="http://schemas.microsoft.com/office/word/2016/wordml/cid" xmlns:w16="http://schemas.microsoft.com/office/word/2018/wordml" xmlns:w16du="http://schemas.microsoft.com/office/word/2023/wordml/word16du" xmlns:w16sdtdh="http://schemas.microsoft.com/office/word/2020/wordml/sdtdatahash" xmlns:w16sdtfl="http://schemas.microsoft.com/office/word/2024/wordml/sdtformatlock" xmlns:w16se="http://schemas.microsoft.com/office/word/2015/wordml/symex" xmlns:wpg="http://schemas.microsoft.com/office/word/2010/wordprocessingGroup" xmlns:wpi="http://schemas.microsoft.com/office/word/2010/wordprocessingInk" xmlns:wne="http://schemas.microsoft.com/office/word/2006/wordml" xmlns:wps="http://schemas.microsoft.com/office/word/2010/wordprocessingShape" mc:Ignorable="w14 w15 w16se w16cid w16 w16cex w16sdtdh w16sdtfl w16du wp14">
   <w:body>
     <w:p>
       <w:pPr>
@@ -8,28 +8,40 @@
         <w:rPr>
           <w:b/>
           <w:bCs/>
+          <w:caps/>
         </w:rPr>
       </w:pPr>
       <w:r>
         <w:rPr>
           <w:b/>
           <w:bCs/>
+          <w:caps/>
         </w:rPr>
-        <w:t xml:space="preserve">[IF Jurisdiction = "Massachusetts"]IN THE UNITED STATES DISTRICT COURT FOR THE DISTRICT OF MASSACHUSETTS[ELSE IF Jurisdiction = "New Hampshire"]IN THE UNITED STATES DISTRICT COURT FOR THE DISTRICT OF NEW HAMPSHIRE[ELSE]IN THE UNITED STATES DISTRICT COURT FOR THE DISTRICT OF </w:t>
+        <w:t xml:space="preserve">IN THE UNITED STATES DISTRICT COURT FOR THE DISTRICT OF </w:t>
       </w:r>
       <w:r>
         <w:rPr>
           <w:b/>
           <w:bCs/>
+          <w:caps/>
         </w:rPr>
-        <w:t>[JURISDICTION]</w:t>
+        <w:t>{IF &lt;Jurisdiction&gt; = "Massachusetts"}MASSACHUSETTS{ELSE IF &lt;Jurisdiction&gt; = "New Hampshire"}NEW HAMPSHIRE{ELSE}</w:t>
       </w:r>
       <w:r>
         <w:rPr>
           <w:b/>
           <w:bCs/>
+          <w:caps/>
         </w:rPr>
-        <w:t>[END IF]</w:t>
+        <w:t>&lt;JURISDICTION&gt;</w:t>
+      </w:r>
+      <w:r>
+        <w:rPr>
+          <w:b/>
+          <w:bCs/>
+          <w:caps/>
+        </w:rPr>
+        <w:t>{END IF}</w:t>
       </w:r>
     </w:p>
     <w:p/>
@@ -87,13 +99,7 @@
           </w:tcPr>
           <w:p>
             <w:r>
-              <w:t>[</w:t>
-            </w:r>
-            <w:r>
-              <w:t>PETITIONER NAME</w:t>
-            </w:r>
-            <w:r>
-              <w:t>],</w:t>
+              <w:t>&lt;PETITIONER NAME&gt;,</w:t>
             </w:r>
           </w:p>
         </w:tc>
@@ -184,7 +190,7 @@
               <w:jc w:val="right"/>
             </w:pPr>
             <w:r>
-              <w:t>DOCKET NO. [CASE NUMBER]</w:t>
+              <w:t>DOCKET NO. &lt;CASE NUMBER&gt;</w:t>
             </w:r>
           </w:p>
         </w:tc>
@@ -196,7 +202,7 @@
           </w:tcPr>
           <w:p>
             <w:r>
-              <w:t>[DEFENDANT NAME],</w:t>
+              <w:t>&lt;DEFENDANT NAME&gt;,</w:t>
             </w:r>
           </w:p>
         </w:tc>
@@ -317,13 +323,7 @@
         <w:t>Petitioner</w:t>
       </w:r>
       <w:r>
-        <w:t>, [</w:t>
-      </w:r>
-      <w:r>
-        <w:t>Petitioner Name</w:t>
-      </w:r>
-      <w:r>
-        <w:t>], is an individual residing in [Jurisdiction].</w:t>
+        <w:t>, &lt;Petitioner Name&gt;, is an individual residing in &lt;Jurisdiction&gt;.</w:t>
       </w:r>
     </w:p>
     <w:p>
@@ -339,7 +339,7 @@
         <w:t>Respondent</w:t>
       </w:r>
       <w:r>
-        <w:t xml:space="preserve"> is the [Defendant Name] and the warden in the Detention Facility in [Jurisdiction].</w:t>
+        <w:t xml:space="preserve"> is the &lt;Defendant Name&gt; and the warden in the Detention Facility in &lt;Jurisdiction&gt;.</w:t>
       </w:r>
     </w:p>
     <w:p>
@@ -352,7 +352,7 @@
         <w:spacing w:after="240"/>
       </w:pPr>
       <w:r>
-        <w:t>This action is brought pursuant to [Jurisdiction] law. [IF Jurisdiction = "Massachusetts"]See Mass. Gen. Laws ch. 260, § 2.[ELSE IF Jurisdiction = "New Hampshire"]See N.H. Rev. Stat. Ann. § 508:4.[ELSE]See applicable federal statutory provisions.[END IF]</w:t>
+        <w:t>This action is brought pursuant to &lt;Jurisdiction&gt; law. {IF &lt;Jurisdiction&gt; = "Massachusetts"}See Mass. Gen. Laws ch. 260, § 2.{ELSE IF &lt;Jurisdiction&gt; = "New Hampshire"}See N.H. Rev. Stat. Ann. § 508:4.{ELSE}See applicable federal statutory provisions.{END IF}</w:t>
       </w:r>
     </w:p>
     <w:p>
@@ -360,7 +360,7 @@
         <w:spacing w:after="240"/>
       </w:pPr>
       <w:r>
-        <w:t>[IF Type of Habeas Petition = "GO Class"]</w:t>
+        <w:t>{IF &lt;Type of Habeas Petition&gt; = "GO Class"}</w:t>
       </w:r>
     </w:p>
     <w:p>
@@ -372,6 +372,7 @@
         </w:numPr>
         <w:spacing w:after="240"/>
       </w:pPr>
+      <w:proofErr w:type="gramStart"/>
       <w:r>
         <w:t>Petitioner</w:t>
       </w:r>
@@ -379,7 +380,11 @@
         <w:t xml:space="preserve"> </w:t>
       </w:r>
       <w:r>
-        <w:t>brings this action on behalf of all similarly situated parties as a GO Class proceeding.</w:t>
+        <w:t>brings</w:t>
+      </w:r>
+      <w:proofErr w:type="gramEnd"/>
+      <w:r>
+        <w:t xml:space="preserve"> this action on behalf of all similarly situated parties as a GO Class proceeding.</w:t>
       </w:r>
     </w:p>
     <w:p>
@@ -387,7 +392,7 @@
         <w:spacing w:after="240"/>
       </w:pPr>
       <w:r>
-        <w:t>[END IF]</w:t>
+        <w:t>{END IF}</w:t>
       </w:r>
     </w:p>
     <w:p>
@@ -400,7 +405,7 @@
         <w:spacing w:after="240"/>
       </w:pPr>
       <w:r>
-        <w:t>[IF Type of Habeas Petition = "GO Class"]</w:t>
+        <w:t>{IF &lt;Type of Habeas Petition&gt; = "GO Class"}</w:t>
       </w:r>
       <w:r>
         <w:t xml:space="preserve"> </w:t>
@@ -412,7 +417,7 @@
         <w:t xml:space="preserve"> </w:t>
       </w:r>
       <w:r>
-        <w:t>seeks class-wide declaratory and injunctive relief on behalf of all class members.[ELSE]</w:t>
+        <w:t>seeks class-wide declaratory and injunctive relief on behalf of all class members.{ELSE}</w:t>
       </w:r>
       <w:r>
         <w:t xml:space="preserve"> </w:t>
@@ -424,7 +429,7 @@
         <w:t xml:space="preserve"> </w:t>
       </w:r>
       <w:r>
-        <w:t>seeks individual habeas corpus relief and an immediate bond hearing.[END IF]</w:t>
+        <w:t>seeks individual habeas corpus relief and an immediate bond hearing.{END IF}</w:t>
       </w:r>
     </w:p>
     <w:p>
@@ -437,7 +442,7 @@
         <w:spacing w:after="240"/>
       </w:pPr>
       <w:r>
-        <w:t>Petitioner [Petitioner Name] is a citizen of [Country of Citizenship] and has been continuously present in the United States since [Continuous Residence Date].</w:t>
+        <w:t>Petitioner &lt;Petitioner Name&gt; is a citizen of &lt;Country of Citizenship&gt; and has been continuously present in the United States since &lt;Continuous Residence Date&gt;.</w:t>
       </w:r>
     </w:p>
     <w:p>
@@ -450,7 +455,7 @@
         <w:spacing w:after="240"/>
       </w:pPr>
       <w:r>
-        <w:t>2. Petitioner entered the United States without inspection on or about [Date of Entry] at or near [Entry Location].</w:t>
+        <w:t>Petitioner entered the United States without inspection on or about &lt;Date of Entry&gt; at or near &lt;Entry Location&gt;.</w:t>
       </w:r>
     </w:p>
     <w:p>
@@ -463,7 +468,6 @@
         <w:spacing w:after="240"/>
       </w:pPr>
       <w:r>
-        <w:lastRenderedPageBreak/>
         <w:t>[NOTE TO PRACTITIONER: Include community ties, absence of criminal record, and family members.]</w:t>
       </w:r>
     </w:p>
@@ -477,7 +481,8 @@
         <w:spacing w:after="240"/>
       </w:pPr>
       <w:r>
-        <w:t>Petitioner was arrested in [Jurisdiction] by U.S. Immigration and Customs Enforcement on or about [Date of Arrest].</w:t>
+        <w:lastRenderedPageBreak/>
+        <w:t>Petitioner was arrested in &lt;Jurisdiction&gt; by U.S. Immigration and Customs Enforcement on or about &lt;Date of Arrest&gt;.</w:t>
       </w:r>
     </w:p>
     <w:p>
@@ -489,8 +494,21 @@
         </w:numPr>
         <w:spacing w:after="240"/>
       </w:pPr>
-      <w:r>
-        <w:t>Petitioner is currently detained in the physical custody of Respondents at the [Detention Facility]. [He/She] [is/are] being held without an individualized bond hearing before an Immigration Judge, violating [Petitioner's] Fifth Amendment due process rights.</w:t>
+      <w:proofErr w:type="gramStart"/>
+      <w:r>
+        <w:t>Petitioner is</w:t>
+      </w:r>
+      <w:proofErr w:type="gramEnd"/>
+      <w:r>
+        <w:t xml:space="preserve"> currently detained in the physical custody of Respondents at the &lt;Detention Facility&gt;. </w:t>
+      </w:r>
+      <w:proofErr w:type="gramStart"/>
+      <w:r>
+        <w:t>Petitioner is</w:t>
+      </w:r>
+      <w:proofErr w:type="gramEnd"/>
+      <w:r>
+        <w:t xml:space="preserve"> being held without an individualized bond hearing before an Immigration Judge, violating Petitioner's Fifth Amendment due process rights.</w:t>
       </w:r>
     </w:p>
     <w:p>
@@ -509,7 +527,7 @@
 </file>
 
 <file path=word/numbering.xml><?xml version="1.0" encoding="utf-8"?>
-<w:numbering xmlns:wpc="http://schemas.microsoft.com/office/word/2010/wordprocessingCanvas" xmlns:cx="http://schemas.microsoft.com/office/drawing/2014/chartex" xmlns:cx1="http://schemas.microsoft.com/office/drawing/2015/9/8/chartex" xmlns:cx2="http://schemas.microsoft.com/office/drawing/2015/10/21/chartex" xmlns:cx3="http://schemas.microsoft.com/office/drawing/2016/5/9/chartex" xmlns:cx4="http://schemas.microsoft.com/office/drawing/2016/5/10/chartex" xmlns:cx5="http://schemas.microsoft.com/office/drawing/2016/5/11/chartex" xmlns:cx6="http://schemas.microsoft.com/office/drawing/2016/5/12/chartex" xmlns:cx7="http://schemas.microsoft.com/office/drawing/2016/5/13/chartex" xmlns:cx8="http://schemas.microsoft.com/office/drawing/2016/5/14/chartex" xmlns:mc="http://schemas.openxmlformats.org/markup-compatibility/2006" xmlns:aink="http://schemas.microsoft.com/office/drawing/2016/ink" xmlns:am3d="http://schemas.microsoft.com/office/drawing/2017/model3d" xmlns:o="urn:schemas-microsoft-com:office:office" xmlns:oel="http://schemas.microsoft.com/office/2019/extlst" xmlns:r="http://schemas.openxmlformats.org/officeDocument/2006/relationships" xmlns:m="http://schemas.openxmlformats.org/officeDocument/2006/math" xmlns:v="urn:schemas-microsoft-com:vml" xmlns:wp14="http://schemas.microsoft.com/office/word/2010/wordprocessingDrawing" xmlns:wp="http://schemas.openxmlformats.org/drawingml/2006/wordprocessingDrawing" xmlns:w10="urn:schemas-microsoft-com:office:word" xmlns:w="http://schemas.openxmlformats.org/wordprocessingml/2006/main" xmlns:w14="http://schemas.microsoft.com/office/word/2010/wordml" xmlns:w15="http://schemas.microsoft.com/office/word/2012/wordml" xmlns:w16cei="http://schemas.microsoft.com/office/word/2026/wordml/cei" xmlns:w16cex="http://schemas.microsoft.com/office/word/2018/wordml/cex" xmlns:w16cid="http://schemas.microsoft.com/office/word/2016/wordml/cid" xmlns:w16="http://schemas.microsoft.com/office/word/2018/wordml" xmlns:w16du="http://schemas.microsoft.com/office/word/2023/wordml/word16du" xmlns:w16sdtdh="http://schemas.microsoft.com/office/word/2020/wordml/sdtdatahash" xmlns:w16sdtfl="http://schemas.microsoft.com/office/word/2024/wordml/sdtformatlock" xmlns:w16se="http://schemas.microsoft.com/office/word/2015/wordml/symex" xmlns:wpg="http://schemas.microsoft.com/office/word/2010/wordprocessingGroup" xmlns:wpi="http://schemas.microsoft.com/office/word/2010/wordprocessingInk" xmlns:wne="http://schemas.microsoft.com/office/word/2006/wordml" xmlns:wps="http://schemas.microsoft.com/office/word/2010/wordprocessingShape" mc:Ignorable="w14 w15 w16se w16cid w16 w16cex w16sdtdh w16sdtfl w16du wp14">
+<w:numbering xmlns:wpc="http://schemas.microsoft.com/office/word/2010/wordprocessingCanvas" xmlns:cx="http://schemas.microsoft.com/office/drawing/2014/chartex" xmlns:cx1="http://schemas.microsoft.com/office/drawing/2015/9/8/chartex" xmlns:cx2="http://schemas.microsoft.com/office/drawing/2015/10/21/chartex" xmlns:cx3="http://schemas.microsoft.com/office/drawing/2016/5/9/chartex" xmlns:cx4="http://schemas.microsoft.com/office/drawing/2016/5/10/chartex" xmlns:cx5="http://schemas.microsoft.com/office/drawing/2016/5/11/chartex" xmlns:cx6="http://schemas.microsoft.com/office/drawing/2016/5/12/chartex" xmlns:cx7="http://schemas.microsoft.com/office/drawing/2016/5/13/chartex" xmlns:cx8="http://schemas.microsoft.com/office/drawing/2016/5/14/chartex" xmlns:mc="http://schemas.openxmlformats.org/markup-compatibility/2006" xmlns:aink="http://schemas.microsoft.com/office/drawing/2016/ink" xmlns:am3d="http://schemas.microsoft.com/office/drawing/2017/model3d" xmlns:o="urn:schemas-microsoft-com:office:office" xmlns:oel="http://schemas.microsoft.com/office/2019/extlst" xmlns:r="http://schemas.openxmlformats.org/officeDocument/2006/relationships" xmlns:m="http://schemas.openxmlformats.org/officeDocument/2006/math" xmlns:v="urn:schemas-microsoft-com:vml" xmlns:wp14="http://schemas.microsoft.com/office/word/2010/wordprocessingDrawing" xmlns:wp="http://schemas.openxmlformats.org/drawingml/2006/wordprocessingDrawing" xmlns:w10="urn:schemas-microsoft-com:office:word" xmlns:w="http://schemas.openxmlformats.org/wordprocessingml/2006/main" xmlns:w14="http://schemas.microsoft.com/office/word/2010/wordml" xmlns:w15="http://schemas.microsoft.com/office/word/2012/wordml" xmlns:w16cex="http://schemas.microsoft.com/office/word/2018/wordml/cex" xmlns:w16cid="http://schemas.microsoft.com/office/word/2016/wordml/cid" xmlns:w16="http://schemas.microsoft.com/office/word/2018/wordml" xmlns:w16du="http://schemas.microsoft.com/office/word/2023/wordml/word16du" xmlns:w16sdtdh="http://schemas.microsoft.com/office/word/2020/wordml/sdtdatahash" xmlns:w16sdtfl="http://schemas.microsoft.com/office/word/2024/wordml/sdtformatlock" xmlns:w16se="http://schemas.microsoft.com/office/word/2015/wordml/symex" xmlns:wpg="http://schemas.microsoft.com/office/word/2010/wordprocessingGroup" xmlns:wpi="http://schemas.microsoft.com/office/word/2010/wordprocessingInk" xmlns:wne="http://schemas.microsoft.com/office/word/2006/wordml" xmlns:wps="http://schemas.microsoft.com/office/word/2010/wordprocessingShape" mc:Ignorable="w14 w15 w16se w16cid w16 w16cex w16sdtdh w16sdtfl w16du wp14">
   <w:abstractNum w:abstractNumId="0" w15:restartNumberingAfterBreak="0">
     <w:nsid w:val="14566BCB"/>
     <w:multiLevelType w:val="multilevel"/>

</xml_diff>